<commit_message>
chore: update Hotmart product_id reference doc
Co-Authored-By: Claude Opus 4.7 <noreply@anthropic.com>
</commit_message>
<xml_diff>
--- a/book/Hotmart product_id.docx
+++ b/book/Hotmart product_id.docx
@@ -523,6 +523,266 @@
     <w:p>
       <w:pPr>
         <w:pStyle w:val="a3"/>
+      </w:pPr>
+    </w:p>
+    <w:p>
+      <w:pPr>
+        <w:pStyle w:val="a3"/>
+      </w:pPr>
+    </w:p>
+    <w:p>
+      <w:pPr>
+        <w:pStyle w:val="a3"/>
+      </w:pPr>
+    </w:p>
+    <w:p>
+      <w:pPr>
+        <w:rPr>
+          <w:lang w:val="en-US"/>
+        </w:rPr>
+      </w:pPr>
+      <w:r>
+        <w:rPr>
+          <w:color w:val="000000" w:themeColor="text1"/>
+          <w:lang w:val="en-US"/>
+        </w:rPr>
+        <w:t xml:space="preserve">VIA-L Interpreter </w:t>
+      </w:r>
+      <w:r>
+        <w:rPr>
+          <w:lang w:val="en-US"/>
+        </w:rPr>
+        <w:t>PRO Monthly</w:t>
+      </w:r>
+      <w:r>
+        <w:rPr>
+          <w:lang w:val="en-US"/>
+        </w:rPr>
+        <w:t xml:space="preserve">: </w:t>
+      </w:r>
+      <w:r>
+        <w:rPr>
+          <w:lang w:val="en-US"/>
+        </w:rPr>
+        <w:t>https://pay.hotmart.com/D106049505G</w:t>
+      </w:r>
+    </w:p>
+    <w:p>
+      <w:pPr>
+        <w:rPr>
+          <w:color w:val="000000" w:themeColor="text1"/>
+          <w:lang w:val="en-US"/>
+        </w:rPr>
+      </w:pPr>
+      <w:r>
+        <w:rPr>
+          <w:color w:val="000000" w:themeColor="text1"/>
+          <w:lang w:val="en-US"/>
+        </w:rPr>
+        <w:t xml:space="preserve">VIA-L Interpreter </w:t>
+      </w:r>
+      <w:r>
+        <w:rPr>
+          <w:color w:val="000000" w:themeColor="text1"/>
+          <w:lang w:val="en-US"/>
+        </w:rPr>
+        <w:t xml:space="preserve">PRO+EXPERT </w:t>
+      </w:r>
+      <w:proofErr w:type="gramStart"/>
+      <w:r>
+        <w:rPr>
+          <w:color w:val="000000" w:themeColor="text1"/>
+          <w:lang w:val="en-US"/>
+        </w:rPr>
+        <w:t>Monthly</w:t>
+      </w:r>
+      <w:r>
+        <w:rPr>
+          <w:color w:val="000000" w:themeColor="text1"/>
+          <w:lang w:val="en-US"/>
+        </w:rPr>
+        <w:t xml:space="preserve"> :</w:t>
+      </w:r>
+      <w:proofErr w:type="gramEnd"/>
+      <w:r>
+        <w:rPr>
+          <w:color w:val="000000" w:themeColor="text1"/>
+          <w:lang w:val="en-US"/>
+        </w:rPr>
+        <w:t xml:space="preserve"> </w:t>
+      </w:r>
+      <w:r>
+        <w:rPr>
+          <w:color w:val="000000" w:themeColor="text1"/>
+          <w:lang w:val="en-US"/>
+        </w:rPr>
+        <w:t>https://pay.hotmart.com/K106049657S</w:t>
+      </w:r>
+    </w:p>
+    <w:p>
+      <w:pPr>
+        <w:rPr>
+          <w:rFonts w:eastAsia="Times New Roman" w:cstheme="minorHAnsi"/>
+          <w:color w:val="000000" w:themeColor="text1"/>
+          <w:kern w:val="0"/>
+          <w:lang w:val="en-US" w:eastAsia="ru-RU"/>
+          <w14:ligatures w14:val="none"/>
+        </w:rPr>
+      </w:pPr>
+      <w:r>
+        <w:rPr>
+          <w:rFonts w:eastAsia="Times New Roman" w:cstheme="minorHAnsi"/>
+          <w:color w:val="000000" w:themeColor="text1"/>
+          <w:kern w:val="0"/>
+          <w:lang w:eastAsia="ru-RU"/>
+          <w14:ligatures w14:val="none"/>
+        </w:rPr>
+        <w:t xml:space="preserve">VIA-L Interpreter ELITE </w:t>
+      </w:r>
+      <w:r>
+        <w:rPr>
+          <w:rFonts w:ascii="Times New Roman" w:eastAsia="Times New Roman" w:hAnsi="Times New Roman" w:cs="Times New Roman"/>
+          <w:color w:val="000000" w:themeColor="text1"/>
+          <w:kern w:val="0"/>
+          <w:lang w:eastAsia="ru-RU"/>
+          <w14:ligatures w14:val="none"/>
+        </w:rPr>
+        <w:t>•</w:t>
+      </w:r>
+      <w:r>
+        <w:rPr>
+          <w:rFonts w:eastAsia="Times New Roman" w:cstheme="minorHAnsi"/>
+          <w:color w:val="000000" w:themeColor="text1"/>
+          <w:kern w:val="0"/>
+          <w:lang w:eastAsia="ru-RU"/>
+          <w14:ligatures w14:val="none"/>
+        </w:rPr>
+        <w:t xml:space="preserve"> </w:t>
+      </w:r>
+      <w:r>
+        <w:rPr>
+          <w:rFonts w:eastAsia="Times New Roman" w:cstheme="minorHAnsi"/>
+          <w:color w:val="000000" w:themeColor="text1"/>
+          <w:kern w:val="0"/>
+          <w:lang w:val="en-US" w:eastAsia="ru-RU"/>
+          <w14:ligatures w14:val="none"/>
+        </w:rPr>
+        <w:t>8</w:t>
+      </w:r>
+      <w:r>
+        <w:rPr>
+          <w:rFonts w:eastAsia="Times New Roman" w:cstheme="minorHAnsi"/>
+          <w:color w:val="000000" w:themeColor="text1"/>
+          <w:kern w:val="0"/>
+          <w:lang w:eastAsia="ru-RU"/>
+          <w14:ligatures w14:val="none"/>
+        </w:rPr>
+        <w:t xml:space="preserve"> weeks</w:t>
+      </w:r>
+      <w:r>
+        <w:rPr>
+          <w:rFonts w:eastAsia="Times New Roman" w:cstheme="minorHAnsi"/>
+          <w:color w:val="000000" w:themeColor="text1"/>
+          <w:kern w:val="0"/>
+          <w:lang w:val="en-US" w:eastAsia="ru-RU"/>
+          <w14:ligatures w14:val="none"/>
+        </w:rPr>
+        <w:t xml:space="preserve">: </w:t>
+      </w:r>
+      <w:r>
+        <w:rPr>
+          <w:rFonts w:eastAsia="Times New Roman" w:cstheme="minorHAnsi"/>
+          <w:color w:val="000000" w:themeColor="text1"/>
+          <w:kern w:val="0"/>
+          <w:lang w:val="en-US" w:eastAsia="ru-RU"/>
+          <w14:ligatures w14:val="none"/>
+        </w:rPr>
+        <w:t>https://pay.hotmart.com/W106049757Q</w:t>
+      </w:r>
+    </w:p>
+    <w:p>
+      <w:pPr>
+        <w:rPr>
+          <w:rFonts w:ascii="Times New Roman" w:eastAsia="Times New Roman" w:hAnsi="Times New Roman" w:cs="Times New Roman"/>
+          <w:kern w:val="0"/>
+          <w:lang w:val="en-US" w:eastAsia="ru-RU"/>
+          <w14:ligatures w14:val="none"/>
+        </w:rPr>
+      </w:pPr>
+      <w:r>
+        <w:rPr>
+          <w:rFonts w:ascii="Times New Roman" w:eastAsia="Times New Roman" w:hAnsi="Times New Roman" w:cs="Times New Roman"/>
+          <w:kern w:val="0"/>
+          <w:lang w:val="en-US" w:eastAsia="ru-RU"/>
+          <w14:ligatures w14:val="none"/>
+        </w:rPr>
+        <w:t xml:space="preserve">VIA-L Interpreter ELITE • 12 </w:t>
+      </w:r>
+      <w:proofErr w:type="gramStart"/>
+      <w:r>
+        <w:rPr>
+          <w:rFonts w:ascii="Times New Roman" w:eastAsia="Times New Roman" w:hAnsi="Times New Roman" w:cs="Times New Roman"/>
+          <w:kern w:val="0"/>
+          <w:lang w:val="en-US" w:eastAsia="ru-RU"/>
+          <w14:ligatures w14:val="none"/>
+        </w:rPr>
+        <w:t>weeks</w:t>
+      </w:r>
+      <w:r>
+        <w:rPr>
+          <w:rFonts w:ascii="Times New Roman" w:eastAsia="Times New Roman" w:hAnsi="Times New Roman" w:cs="Times New Roman"/>
+          <w:kern w:val="0"/>
+          <w:lang w:val="en-US" w:eastAsia="ru-RU"/>
+          <w14:ligatures w14:val="none"/>
+        </w:rPr>
+        <w:t xml:space="preserve"> </w:t>
+      </w:r>
+      <w:r>
+        <w:rPr>
+          <w:rFonts w:ascii="Times New Roman" w:eastAsia="Times New Roman" w:hAnsi="Times New Roman" w:cs="Times New Roman"/>
+          <w:kern w:val="0"/>
+          <w:lang w:val="en-US" w:eastAsia="ru-RU"/>
+          <w14:ligatures w14:val="none"/>
+        </w:rPr>
+        <w:t>:</w:t>
+      </w:r>
+      <w:proofErr w:type="gramEnd"/>
+      <w:r>
+        <w:rPr>
+          <w:rFonts w:ascii="Times New Roman" w:eastAsia="Times New Roman" w:hAnsi="Times New Roman" w:cs="Times New Roman"/>
+          <w:kern w:val="0"/>
+          <w:lang w:val="en-US" w:eastAsia="ru-RU"/>
+          <w14:ligatures w14:val="none"/>
+        </w:rPr>
+        <w:t xml:space="preserve"> </w:t>
+      </w:r>
+      <w:r>
+        <w:rPr>
+          <w:rFonts w:ascii="Times New Roman" w:eastAsia="Times New Roman" w:hAnsi="Times New Roman" w:cs="Times New Roman"/>
+          <w:kern w:val="0"/>
+          <w:lang w:val="en-US" w:eastAsia="ru-RU"/>
+          <w14:ligatures w14:val="none"/>
+        </w:rPr>
+        <w:t>https://pay.hotmart.com/A106049851J</w:t>
+      </w:r>
+    </w:p>
+    <w:p>
+      <w:pPr>
+        <w:rPr>
+          <w:rFonts w:eastAsia="Times New Roman" w:cstheme="minorHAnsi"/>
+          <w:color w:val="BFBFBF"/>
+          <w:kern w:val="0"/>
+          <w:lang w:val="en-US" w:eastAsia="ru-RU"/>
+          <w14:ligatures w14:val="none"/>
+        </w:rPr>
+      </w:pPr>
+    </w:p>
+    <w:p>
+      <w:pPr>
+        <w:rPr>
+          <w:color w:val="000000" w:themeColor="text1"/>
+          <w:lang w:val="en-US"/>
+        </w:rPr>
       </w:pPr>
     </w:p>
     <w:sectPr>
@@ -1126,6 +1386,34 @@
       <w:u w:val="single"/>
     </w:rPr>
   </w:style>
+  <w:style w:type="paragraph" w:styleId="a7">
+    <w:name w:val="Normal (Web)"/>
+    <w:basedOn w:val="a"/>
+    <w:uiPriority w:val="99"/>
+    <w:semiHidden/>
+    <w:unhideWhenUsed/>
+    <w:rsid w:val="008F6754"/>
+    <w:pPr>
+      <w:spacing w:before="100" w:beforeAutospacing="1" w:after="100" w:afterAutospacing="1"/>
+    </w:pPr>
+    <w:rPr>
+      <w:rFonts w:ascii="Times New Roman" w:eastAsia="Times New Roman" w:hAnsi="Times New Roman" w:cs="Times New Roman"/>
+      <w:kern w:val="0"/>
+      <w:lang w:eastAsia="ru-RU"/>
+      <w14:ligatures w14:val="none"/>
+    </w:rPr>
+  </w:style>
+  <w:style w:type="character" w:styleId="a8">
+    <w:name w:val="Strong"/>
+    <w:basedOn w:val="a0"/>
+    <w:uiPriority w:val="22"/>
+    <w:qFormat/>
+    <w:rsid w:val="00C82AEB"/>
+    <w:rPr>
+      <w:b/>
+      <w:bCs/>
+    </w:rPr>
+  </w:style>
 </w:styles>
 </file>
 

</xml_diff>